<commit_message>
Update employment history and experience calculations in CV data
</commit_message>
<xml_diff>
--- a/latestCV/Maninder-Singh-Full-Stack-Developer.docx
+++ b/latestCV/Maninder-Singh-Full-Stack-Developer.docx
@@ -69,7 +69,7 @@
         </w:rPr>
         <w:t xml:space="preserve">  |  </w:t>
       </w:r>
-      <w:hyperlink w:history="1" r:id="rIdailasluvnm2jw_ais2b-p">
+      <w:hyperlink w:history="1" r:id="rIdzpcmlvreevvt1wvya28pt">
         <w:r>
           <w:rPr>
             <w:b/>
@@ -91,7 +91,7 @@
         </w:rPr>
         <w:t xml:space="preserve">  |  </w:t>
       </w:r>
-      <w:hyperlink w:history="1" r:id="rIdgroew9m7lqvwot-njwybr">
+      <w:hyperlink w:history="1" r:id="rIdqde4sg4wegtncgkzumacf">
         <w:r>
           <w:rPr>
             <w:b/>
@@ -1120,7 +1120,7 @@
         </w:numPr>
         <w:spacing w:after="20"/>
       </w:pPr>
-      <w:hyperlink w:history="1" r:id="rIdobnr5kcpnfak55rubmtpm">
+      <w:hyperlink w:history="1" r:id="rId_lz2awh5eniiwweljplf1">
         <w:r>
           <w:rPr>
             <w:b/>
@@ -1152,7 +1152,7 @@
         </w:numPr>
         <w:spacing w:after="20"/>
       </w:pPr>
-      <w:hyperlink w:history="1" r:id="rId6jfb0cnlpfanf-esx3qvk">
+      <w:hyperlink w:history="1" r:id="rIdl92rpc6sb-mrexywtzlts">
         <w:r>
           <w:rPr>
             <w:b/>
@@ -1184,7 +1184,7 @@
         </w:numPr>
         <w:spacing w:after="20"/>
       </w:pPr>
-      <w:hyperlink w:history="1" r:id="rIdwgu3_8746fasu5m7nvmrq">
+      <w:hyperlink w:history="1" r:id="rIdg_xzqn2pi47oim7cevwi7">
         <w:r>
           <w:rPr>
             <w:b/>
@@ -1232,7 +1232,7 @@
         </w:numPr>
         <w:spacing w:after="20"/>
       </w:pPr>
-      <w:hyperlink w:history="1" r:id="rIdfkl6e7msxsfrvfkoybhxh">
+      <w:hyperlink w:history="1" r:id="rIdbnswaeyjj9tc2w6zteodr">
         <w:r>
           <w:rPr>
             <w:b/>
@@ -1264,7 +1264,7 @@
         </w:numPr>
         <w:spacing w:after="20"/>
       </w:pPr>
-      <w:hyperlink w:history="1" r:id="rId_s9jnjguy1xhqkuyvzv0o">
+      <w:hyperlink w:history="1" r:id="rId1vfkaxtxq_ucyageg08y9">
         <w:r>
           <w:rPr>
             <w:b/>
@@ -1296,7 +1296,7 @@
         </w:numPr>
         <w:spacing w:after="20"/>
       </w:pPr>
-      <w:hyperlink w:history="1" r:id="rIdzx6_oywedtb5rg7bcdo20">
+      <w:hyperlink w:history="1" r:id="rIdwy7al7tsj1ftzork5ases">
         <w:r>
           <w:rPr>
             <w:b/>
@@ -1328,7 +1328,7 @@
         </w:numPr>
         <w:spacing w:after="20"/>
       </w:pPr>
-      <w:hyperlink w:history="1" r:id="rIdfoyashjrwpyn_dunwcvgh">
+      <w:hyperlink w:history="1" r:id="rIdasmeuqubwypebmdybdfcd">
         <w:r>
           <w:rPr>
             <w:b/>
@@ -1360,7 +1360,7 @@
         </w:numPr>
         <w:spacing w:after="20"/>
       </w:pPr>
-      <w:hyperlink w:history="1" r:id="rIdh4co7qdfeyl9ji7drdual">
+      <w:hyperlink w:history="1" r:id="rId8-ur2ml-vear40nj0m9bt">
         <w:r>
           <w:rPr>
             <w:b/>
@@ -1392,7 +1392,7 @@
         </w:numPr>
         <w:spacing w:after="20"/>
       </w:pPr>
-      <w:hyperlink w:history="1" r:id="rIdb-di90qvhf8xrju-aozuq">
+      <w:hyperlink w:history="1" r:id="rIdpk4vlpceovkcwycshadng">
         <w:r>
           <w:rPr>
             <w:b/>
@@ -1440,7 +1440,7 @@
         </w:numPr>
         <w:spacing w:after="20"/>
       </w:pPr>
-      <w:hyperlink w:history="1" r:id="rId35ju1v7dlwktmbok7bj4a">
+      <w:hyperlink w:history="1" r:id="rIdg3vwxaypu1rsarlqmfzee">
         <w:r>
           <w:rPr>
             <w:b/>
@@ -1472,7 +1472,7 @@
         </w:numPr>
         <w:spacing w:after="20"/>
       </w:pPr>
-      <w:hyperlink w:history="1" r:id="rIdly5pzzzabpdftlfz9zif5">
+      <w:hyperlink w:history="1" r:id="rIdyaabzwszzunvmu2mimduj">
         <w:r>
           <w:rPr>
             <w:b/>
@@ -1504,7 +1504,7 @@
         </w:numPr>
         <w:spacing w:after="20"/>
       </w:pPr>
-      <w:hyperlink w:history="1" r:id="rIdmeultmf02x3vjajpseegd">
+      <w:hyperlink w:history="1" r:id="rIdph6zm4uomgpqrxekf0ygv">
         <w:r>
           <w:rPr>
             <w:b/>
@@ -1672,7 +1672,7 @@
         </w:numPr>
         <w:spacing w:after="20"/>
       </w:pPr>
-      <w:hyperlink w:history="1" r:id="rId8gagebcmszjziolzxgoxm">
+      <w:hyperlink w:history="1" r:id="rIdk7b5zv43k9dszrw-1-78y">
         <w:r>
           <w:rPr>
             <w:b/>
@@ -1704,7 +1704,7 @@
         </w:numPr>
         <w:spacing w:after="20"/>
       </w:pPr>
-      <w:hyperlink w:history="1" r:id="rId17iqs2hk6n1y6biypl9pc">
+      <w:hyperlink w:history="1" r:id="rIdmrbho1xsfaod4pitzqjpa">
         <w:r>
           <w:rPr>
             <w:b/>
@@ -1752,7 +1752,7 @@
         </w:numPr>
         <w:spacing w:after="20"/>
       </w:pPr>
-      <w:hyperlink w:history="1" r:id="rIdnjdfved1321h0oat6t4ih">
+      <w:hyperlink w:history="1" r:id="rIdvycd1jv6bmug307-dwc1o">
         <w:r>
           <w:rPr>
             <w:b/>
@@ -1784,7 +1784,7 @@
         </w:numPr>
         <w:spacing w:after="20"/>
       </w:pPr>
-      <w:hyperlink w:history="1" r:id="rIdv5i61ln03fo-erkz05w61">
+      <w:hyperlink w:history="1" r:id="rIdbqzsf03wls08xppuvknww">
         <w:r>
           <w:rPr>
             <w:b/>
@@ -1816,7 +1816,7 @@
         </w:numPr>
         <w:spacing w:after="20"/>
       </w:pPr>
-      <w:hyperlink w:history="1" r:id="rIdcrmkf9x-2jtooyuhgimw9">
+      <w:hyperlink w:history="1" r:id="rId1jqnhjxrffwxziqvrov4a">
         <w:r>
           <w:rPr>
             <w:b/>
@@ -1878,7 +1878,7 @@
         </w:numPr>
         <w:spacing w:after="20"/>
       </w:pPr>
-      <w:hyperlink w:history="1" r:id="rIdu-xm7xcwr6ovl_naahm3z">
+      <w:hyperlink w:history="1" r:id="rIdik2wjjogez3dhorqfbhs7">
         <w:r>
           <w:rPr>
             <w:b/>
@@ -1910,7 +1910,7 @@
         </w:numPr>
         <w:spacing w:after="20"/>
       </w:pPr>
-      <w:hyperlink w:history="1" r:id="rIdiuvvwl-tvekafonzjjrdk">
+      <w:hyperlink w:history="1" r:id="rId7w5rnpnxgqhyxxqmmj0ai">
         <w:r>
           <w:rPr>
             <w:b/>
@@ -1958,7 +1958,7 @@
         </w:numPr>
         <w:spacing w:after="20"/>
       </w:pPr>
-      <w:hyperlink w:history="1" r:id="rIdf7vyrkgnhglgjsu1hc46c">
+      <w:hyperlink w:history="1" r:id="rId09gqpakxnsqhl0laygmtr">
         <w:r>
           <w:rPr>
             <w:b/>
@@ -1990,7 +1990,7 @@
         </w:numPr>
         <w:spacing w:after="20"/>
       </w:pPr>
-      <w:hyperlink w:history="1" r:id="rIdvddiyl7bv2uk7--a9yhnn">
+      <w:hyperlink w:history="1" r:id="rIdvn5vkxs0xm8iwi0ljemxg">
         <w:r>
           <w:rPr>
             <w:b/>

</xml_diff>

<commit_message>
Refactor document generation to remove hyperlinks and adjust verification checks
</commit_message>
<xml_diff>
--- a/latestCV/Maninder-Singh-Full-Stack-Developer.docx
+++ b/latestCV/Maninder-Singh-Full-Stack-Developer.docx
@@ -69,19 +69,17 @@
         </w:rPr>
         <w:t xml:space="preserve">  |  </w:t>
       </w:r>
-      <w:hyperlink w:history="1" r:id="rIdzpcmlvreevvt1wvya28pt">
-        <w:r>
-          <w:rPr>
-            <w:b/>
-            <w:bCs/>
-            <w:color w:val="333333"/>
-            <w:sz w:val="20"/>
-            <w:szCs w:val="20"/>
-            <w:rFonts w:ascii="Calibri" w:cs="Calibri" w:eastAsia="Calibri" w:hAnsi="Calibri"/>
-          </w:rPr>
-          <w:t xml:space="preserve">maninder6005@gmail.com</w:t>
-        </w:r>
-      </w:hyperlink>
+      <w:r>
+        <w:rPr>
+          <w:b/>
+          <w:bCs/>
+          <w:color w:val="333333"/>
+          <w:sz w:val="20"/>
+          <w:szCs w:val="20"/>
+          <w:rFonts w:ascii="Calibri" w:cs="Calibri" w:eastAsia="Calibri" w:hAnsi="Calibri"/>
+        </w:rPr>
+        <w:t xml:space="preserve">maninder6005@gmail.com</w:t>
+      </w:r>
       <w:r>
         <w:rPr>
           <w:color w:val="B4A7D6"/>
@@ -91,19 +89,17 @@
         </w:rPr>
         <w:t xml:space="preserve">  |  </w:t>
       </w:r>
-      <w:hyperlink w:history="1" r:id="rIdqde4sg4wegtncgkzumacf">
-        <w:r>
-          <w:rPr>
-            <w:b/>
-            <w:bCs/>
-            <w:color w:val="333333"/>
-            <w:sz w:val="20"/>
-            <w:szCs w:val="20"/>
-            <w:rFonts w:ascii="Calibri" w:cs="Calibri" w:eastAsia="Calibri" w:hAnsi="Calibri"/>
-          </w:rPr>
-          <w:t xml:space="preserve">linkedin.com/in/maninder0000</w:t>
-        </w:r>
-      </w:hyperlink>
+      <w:r>
+        <w:rPr>
+          <w:b/>
+          <w:bCs/>
+          <w:color w:val="333333"/>
+          <w:sz w:val="20"/>
+          <w:szCs w:val="20"/>
+          <w:rFonts w:ascii="Calibri" w:cs="Calibri" w:eastAsia="Calibri" w:hAnsi="Calibri"/>
+        </w:rPr>
+        <w:t xml:space="preserve">linkedin.com/in/maninder0000</w:t>
+      </w:r>
       <w:r>
         <w:rPr>
           <w:color w:val="B4A7D6"/>
@@ -1120,19 +1116,17 @@
         </w:numPr>
         <w:spacing w:after="20"/>
       </w:pPr>
-      <w:hyperlink w:history="1" r:id="rId_lz2awh5eniiwweljplf1">
-        <w:r>
-          <w:rPr>
-            <w:b/>
-            <w:bCs/>
-            <w:color w:val="5B4B8A"/>
-            <w:sz w:val="20"/>
-            <w:szCs w:val="20"/>
-            <w:rFonts w:ascii="Calibri" w:cs="Calibri" w:eastAsia="Calibri" w:hAnsi="Calibri"/>
-          </w:rPr>
-          <w:t xml:space="preserve">app.missionalagents.com</w:t>
-        </w:r>
-      </w:hyperlink>
+      <w:r>
+        <w:rPr>
+          <w:b/>
+          <w:bCs/>
+          <w:color w:val="5B4B8A"/>
+          <w:sz w:val="20"/>
+          <w:szCs w:val="20"/>
+          <w:rFonts w:ascii="Calibri" w:cs="Calibri" w:eastAsia="Calibri" w:hAnsi="Calibri"/>
+        </w:rPr>
+        <w:t xml:space="preserve">app.missionalagents.com</w:t>
+      </w:r>
       <w:r>
         <w:rPr>
           <w:color w:val="222222"/>
@@ -1152,19 +1146,17 @@
         </w:numPr>
         <w:spacing w:after="20"/>
       </w:pPr>
-      <w:hyperlink w:history="1" r:id="rIdl92rpc6sb-mrexywtzlts">
-        <w:r>
-          <w:rPr>
-            <w:b/>
-            <w:bCs/>
-            <w:color w:val="5B4B8A"/>
-            <w:sz w:val="20"/>
-            <w:szCs w:val="20"/>
-            <w:rFonts w:ascii="Calibri" w:cs="Calibri" w:eastAsia="Calibri" w:hAnsi="Calibri"/>
-          </w:rPr>
-          <w:t xml:space="preserve">providerpassport.io</w:t>
-        </w:r>
-      </w:hyperlink>
+      <w:r>
+        <w:rPr>
+          <w:b/>
+          <w:bCs/>
+          <w:color w:val="5B4B8A"/>
+          <w:sz w:val="20"/>
+          <w:szCs w:val="20"/>
+          <w:rFonts w:ascii="Calibri" w:cs="Calibri" w:eastAsia="Calibri" w:hAnsi="Calibri"/>
+        </w:rPr>
+        <w:t xml:space="preserve">providerpassport.io</w:t>
+      </w:r>
       <w:r>
         <w:rPr>
           <w:color w:val="222222"/>
@@ -1184,19 +1176,17 @@
         </w:numPr>
         <w:spacing w:after="20"/>
       </w:pPr>
-      <w:hyperlink w:history="1" r:id="rIdg_xzqn2pi47oim7cevwi7">
-        <w:r>
-          <w:rPr>
-            <w:b/>
-            <w:bCs/>
-            <w:color w:val="5B4B8A"/>
-            <w:sz w:val="20"/>
-            <w:szCs w:val="20"/>
-            <w:rFonts w:ascii="Calibri" w:cs="Calibri" w:eastAsia="Calibri" w:hAnsi="Calibri"/>
-          </w:rPr>
-          <w:t xml:space="preserve">staff.mca.ca</w:t>
-        </w:r>
-      </w:hyperlink>
+      <w:r>
+        <w:rPr>
+          <w:b/>
+          <w:bCs/>
+          <w:color w:val="5B4B8A"/>
+          <w:sz w:val="20"/>
+          <w:szCs w:val="20"/>
+          <w:rFonts w:ascii="Calibri" w:cs="Calibri" w:eastAsia="Calibri" w:hAnsi="Calibri"/>
+        </w:rPr>
+        <w:t xml:space="preserve">staff.mca.ca</w:t>
+      </w:r>
       <w:r>
         <w:rPr>
           <w:color w:val="222222"/>
@@ -1232,19 +1222,17 @@
         </w:numPr>
         <w:spacing w:after="20"/>
       </w:pPr>
-      <w:hyperlink w:history="1" r:id="rIdbnswaeyjj9tc2w6zteodr">
-        <w:r>
-          <w:rPr>
-            <w:b/>
-            <w:bCs/>
-            <w:color w:val="5B4B8A"/>
-            <w:sz w:val="20"/>
-            <w:szCs w:val="20"/>
-            <w:rFonts w:ascii="Calibri" w:cs="Calibri" w:eastAsia="Calibri" w:hAnsi="Calibri"/>
-          </w:rPr>
-          <w:t xml:space="preserve">koffer-to-go.de</w:t>
-        </w:r>
-      </w:hyperlink>
+      <w:r>
+        <w:rPr>
+          <w:b/>
+          <w:bCs/>
+          <w:color w:val="5B4B8A"/>
+          <w:sz w:val="20"/>
+          <w:szCs w:val="20"/>
+          <w:rFonts w:ascii="Calibri" w:cs="Calibri" w:eastAsia="Calibri" w:hAnsi="Calibri"/>
+        </w:rPr>
+        <w:t xml:space="preserve">koffer-to-go.de</w:t>
+      </w:r>
       <w:r>
         <w:rPr>
           <w:color w:val="222222"/>
@@ -1264,19 +1252,17 @@
         </w:numPr>
         <w:spacing w:after="20"/>
       </w:pPr>
-      <w:hyperlink w:history="1" r:id="rId1vfkaxtxq_ucyageg08y9">
-        <w:r>
-          <w:rPr>
-            <w:b/>
-            <w:bCs/>
-            <w:color w:val="5B4B8A"/>
-            <w:sz w:val="20"/>
-            <w:szCs w:val="20"/>
-            <w:rFonts w:ascii="Calibri" w:cs="Calibri" w:eastAsia="Calibri" w:hAnsi="Calibri"/>
-          </w:rPr>
-          <w:t xml:space="preserve">frostkrone.de</w:t>
-        </w:r>
-      </w:hyperlink>
+      <w:r>
+        <w:rPr>
+          <w:b/>
+          <w:bCs/>
+          <w:color w:val="5B4B8A"/>
+          <w:sz w:val="20"/>
+          <w:szCs w:val="20"/>
+          <w:rFonts w:ascii="Calibri" w:cs="Calibri" w:eastAsia="Calibri" w:hAnsi="Calibri"/>
+        </w:rPr>
+        <w:t xml:space="preserve">frostkrone.de</w:t>
+      </w:r>
       <w:r>
         <w:rPr>
           <w:color w:val="222222"/>
@@ -1296,19 +1282,17 @@
         </w:numPr>
         <w:spacing w:after="20"/>
       </w:pPr>
-      <w:hyperlink w:history="1" r:id="rIdwy7al7tsj1ftzork5ases">
-        <w:r>
-          <w:rPr>
-            <w:b/>
-            <w:bCs/>
-            <w:color w:val="5B4B8A"/>
-            <w:sz w:val="20"/>
-            <w:szCs w:val="20"/>
-            <w:rFonts w:ascii="Calibri" w:cs="Calibri" w:eastAsia="Calibri" w:hAnsi="Calibri"/>
-          </w:rPr>
-          <w:t xml:space="preserve">meentzen.de</w:t>
-        </w:r>
-      </w:hyperlink>
+      <w:r>
+        <w:rPr>
+          <w:b/>
+          <w:bCs/>
+          <w:color w:val="5B4B8A"/>
+          <w:sz w:val="20"/>
+          <w:szCs w:val="20"/>
+          <w:rFonts w:ascii="Calibri" w:cs="Calibri" w:eastAsia="Calibri" w:hAnsi="Calibri"/>
+        </w:rPr>
+        <w:t xml:space="preserve">meentzen.de</w:t>
+      </w:r>
       <w:r>
         <w:rPr>
           <w:color w:val="222222"/>
@@ -1328,19 +1312,17 @@
         </w:numPr>
         <w:spacing w:after="20"/>
       </w:pPr>
-      <w:hyperlink w:history="1" r:id="rIdasmeuqubwypebmdybdfcd">
-        <w:r>
-          <w:rPr>
-            <w:b/>
-            <w:bCs/>
-            <w:color w:val="5B4B8A"/>
-            <w:sz w:val="20"/>
-            <w:szCs w:val="20"/>
-            <w:rFonts w:ascii="Calibri" w:cs="Calibri" w:eastAsia="Calibri" w:hAnsi="Calibri"/>
-          </w:rPr>
-          <w:t xml:space="preserve">rbb-online-shop.de</w:t>
-        </w:r>
-      </w:hyperlink>
+      <w:r>
+        <w:rPr>
+          <w:b/>
+          <w:bCs/>
+          <w:color w:val="5B4B8A"/>
+          <w:sz w:val="20"/>
+          <w:szCs w:val="20"/>
+          <w:rFonts w:ascii="Calibri" w:cs="Calibri" w:eastAsia="Calibri" w:hAnsi="Calibri"/>
+        </w:rPr>
+        <w:t xml:space="preserve">rbb-online-shop.de</w:t>
+      </w:r>
       <w:r>
         <w:rPr>
           <w:color w:val="222222"/>
@@ -1360,19 +1342,17 @@
         </w:numPr>
         <w:spacing w:after="20"/>
       </w:pPr>
-      <w:hyperlink w:history="1" r:id="rId8-ur2ml-vear40nj0m9bt">
-        <w:r>
-          <w:rPr>
-            <w:b/>
-            <w:bCs/>
-            <w:color w:val="5B4B8A"/>
-            <w:sz w:val="20"/>
-            <w:szCs w:val="20"/>
-            <w:rFonts w:ascii="Calibri" w:cs="Calibri" w:eastAsia="Calibri" w:hAnsi="Calibri"/>
-          </w:rPr>
-          <w:t xml:space="preserve">sassyclassy.de</w:t>
-        </w:r>
-      </w:hyperlink>
+      <w:r>
+        <w:rPr>
+          <w:b/>
+          <w:bCs/>
+          <w:color w:val="5B4B8A"/>
+          <w:sz w:val="20"/>
+          <w:szCs w:val="20"/>
+          <w:rFonts w:ascii="Calibri" w:cs="Calibri" w:eastAsia="Calibri" w:hAnsi="Calibri"/>
+        </w:rPr>
+        <w:t xml:space="preserve">sassyclassy.de</w:t>
+      </w:r>
       <w:r>
         <w:rPr>
           <w:color w:val="222222"/>
@@ -1392,19 +1372,17 @@
         </w:numPr>
         <w:spacing w:after="20"/>
       </w:pPr>
-      <w:hyperlink w:history="1" r:id="rIdpk4vlpceovkcwycshadng">
-        <w:r>
-          <w:rPr>
-            <w:b/>
-            <w:bCs/>
-            <w:color w:val="5B4B8A"/>
-            <w:sz w:val="20"/>
-            <w:szCs w:val="20"/>
-            <w:rFonts w:ascii="Calibri" w:cs="Calibri" w:eastAsia="Calibri" w:hAnsi="Calibri"/>
-          </w:rPr>
-          <w:t xml:space="preserve">val-store.com</w:t>
-        </w:r>
-      </w:hyperlink>
+      <w:r>
+        <w:rPr>
+          <w:b/>
+          <w:bCs/>
+          <w:color w:val="5B4B8A"/>
+          <w:sz w:val="20"/>
+          <w:szCs w:val="20"/>
+          <w:rFonts w:ascii="Calibri" w:cs="Calibri" w:eastAsia="Calibri" w:hAnsi="Calibri"/>
+        </w:rPr>
+        <w:t xml:space="preserve">val-store.com</w:t>
+      </w:r>
       <w:r>
         <w:rPr>
           <w:color w:val="222222"/>
@@ -1440,19 +1418,17 @@
         </w:numPr>
         <w:spacing w:after="20"/>
       </w:pPr>
-      <w:hyperlink w:history="1" r:id="rIdg3vwxaypu1rsarlqmfzee">
-        <w:r>
-          <w:rPr>
-            <w:b/>
-            <w:bCs/>
-            <w:color w:val="5B4B8A"/>
-            <w:sz w:val="20"/>
-            <w:szCs w:val="20"/>
-            <w:rFonts w:ascii="Calibri" w:cs="Calibri" w:eastAsia="Calibri" w:hAnsi="Calibri"/>
-          </w:rPr>
-          <w:t xml:space="preserve">schmetterling.de</w:t>
-        </w:r>
-      </w:hyperlink>
+      <w:r>
+        <w:rPr>
+          <w:b/>
+          <w:bCs/>
+          <w:color w:val="5B4B8A"/>
+          <w:sz w:val="20"/>
+          <w:szCs w:val="20"/>
+          <w:rFonts w:ascii="Calibri" w:cs="Calibri" w:eastAsia="Calibri" w:hAnsi="Calibri"/>
+        </w:rPr>
+        <w:t xml:space="preserve">schmetterling.de</w:t>
+      </w:r>
       <w:r>
         <w:rPr>
           <w:color w:val="222222"/>
@@ -1472,19 +1448,17 @@
         </w:numPr>
         <w:spacing w:after="20"/>
       </w:pPr>
-      <w:hyperlink w:history="1" r:id="rIdyaabzwszzunvmu2mimduj">
-        <w:r>
-          <w:rPr>
-            <w:b/>
-            <w:bCs/>
-            <w:color w:val="5B4B8A"/>
-            <w:sz w:val="20"/>
-            <w:szCs w:val="20"/>
-            <w:rFonts w:ascii="Calibri" w:cs="Calibri" w:eastAsia="Calibri" w:hAnsi="Calibri"/>
-          </w:rPr>
-          <w:t xml:space="preserve">locumbay.com</w:t>
-        </w:r>
-      </w:hyperlink>
+      <w:r>
+        <w:rPr>
+          <w:b/>
+          <w:bCs/>
+          <w:color w:val="5B4B8A"/>
+          <w:sz w:val="20"/>
+          <w:szCs w:val="20"/>
+          <w:rFonts w:ascii="Calibri" w:cs="Calibri" w:eastAsia="Calibri" w:hAnsi="Calibri"/>
+        </w:rPr>
+        <w:t xml:space="preserve">locumbay.com</w:t>
+      </w:r>
       <w:r>
         <w:rPr>
           <w:color w:val="222222"/>
@@ -1504,19 +1478,17 @@
         </w:numPr>
         <w:spacing w:after="20"/>
       </w:pPr>
-      <w:hyperlink w:history="1" r:id="rIdph6zm4uomgpqrxekf0ygv">
-        <w:r>
-          <w:rPr>
-            <w:b/>
-            <w:bCs/>
-            <w:color w:val="5B4B8A"/>
-            <w:sz w:val="20"/>
-            <w:szCs w:val="20"/>
-            <w:rFonts w:ascii="Calibri" w:cs="Calibri" w:eastAsia="Calibri" w:hAnsi="Calibri"/>
-          </w:rPr>
-          <w:t xml:space="preserve">local-brand-x.com</w:t>
-        </w:r>
-      </w:hyperlink>
+      <w:r>
+        <w:rPr>
+          <w:b/>
+          <w:bCs/>
+          <w:color w:val="5B4B8A"/>
+          <w:sz w:val="20"/>
+          <w:szCs w:val="20"/>
+          <w:rFonts w:ascii="Calibri" w:cs="Calibri" w:eastAsia="Calibri" w:hAnsi="Calibri"/>
+        </w:rPr>
+        <w:t xml:space="preserve">local-brand-x.com</w:t>
+      </w:r>
       <w:r>
         <w:rPr>
           <w:color w:val="222222"/>
@@ -1672,19 +1644,17 @@
         </w:numPr>
         <w:spacing w:after="20"/>
       </w:pPr>
-      <w:hyperlink w:history="1" r:id="rIdk7b5zv43k9dszrw-1-78y">
-        <w:r>
-          <w:rPr>
-            <w:b/>
-            <w:bCs/>
-            <w:color w:val="5B4B8A"/>
-            <w:sz w:val="20"/>
-            <w:szCs w:val="20"/>
-            <w:rFonts w:ascii="Calibri" w:cs="Calibri" w:eastAsia="Calibri" w:hAnsi="Calibri"/>
-          </w:rPr>
-          <w:t xml:space="preserve">Guild</w:t>
-        </w:r>
-      </w:hyperlink>
+      <w:r>
+        <w:rPr>
+          <w:b/>
+          <w:bCs/>
+          <w:color w:val="5B4B8A"/>
+          <w:sz w:val="20"/>
+          <w:szCs w:val="20"/>
+          <w:rFonts w:ascii="Calibri" w:cs="Calibri" w:eastAsia="Calibri" w:hAnsi="Calibri"/>
+        </w:rPr>
+        <w:t xml:space="preserve">Guild</w:t>
+      </w:r>
       <w:r>
         <w:rPr>
           <w:color w:val="222222"/>
@@ -1704,19 +1674,17 @@
         </w:numPr>
         <w:spacing w:after="20"/>
       </w:pPr>
-      <w:hyperlink w:history="1" r:id="rIdmrbho1xsfaod4pitzqjpa">
-        <w:r>
-          <w:rPr>
-            <w:b/>
-            <w:bCs/>
-            <w:color w:val="5B4B8A"/>
-            <w:sz w:val="20"/>
-            <w:szCs w:val="20"/>
-            <w:rFonts w:ascii="Calibri" w:cs="Calibri" w:eastAsia="Calibri" w:hAnsi="Calibri"/>
-          </w:rPr>
-          <w:t xml:space="preserve">triceraprint.com</w:t>
-        </w:r>
-      </w:hyperlink>
+      <w:r>
+        <w:rPr>
+          <w:b/>
+          <w:bCs/>
+          <w:color w:val="5B4B8A"/>
+          <w:sz w:val="20"/>
+          <w:szCs w:val="20"/>
+          <w:rFonts w:ascii="Calibri" w:cs="Calibri" w:eastAsia="Calibri" w:hAnsi="Calibri"/>
+        </w:rPr>
+        <w:t xml:space="preserve">triceraprint.com</w:t>
+      </w:r>
       <w:r>
         <w:rPr>
           <w:color w:val="222222"/>
@@ -1752,19 +1720,17 @@
         </w:numPr>
         <w:spacing w:after="20"/>
       </w:pPr>
-      <w:hyperlink w:history="1" r:id="rIdvycd1jv6bmug307-dwc1o">
-        <w:r>
-          <w:rPr>
-            <w:b/>
-            <w:bCs/>
-            <w:color w:val="5B4B8A"/>
-            <w:sz w:val="20"/>
-            <w:szCs w:val="20"/>
-            <w:rFonts w:ascii="Calibri" w:cs="Calibri" w:eastAsia="Calibri" w:hAnsi="Calibri"/>
-          </w:rPr>
-          <w:t xml:space="preserve">wpempirebuilder.com</w:t>
-        </w:r>
-      </w:hyperlink>
+      <w:r>
+        <w:rPr>
+          <w:b/>
+          <w:bCs/>
+          <w:color w:val="5B4B8A"/>
+          <w:sz w:val="20"/>
+          <w:szCs w:val="20"/>
+          <w:rFonts w:ascii="Calibri" w:cs="Calibri" w:eastAsia="Calibri" w:hAnsi="Calibri"/>
+        </w:rPr>
+        <w:t xml:space="preserve">wpempirebuilder.com</w:t>
+      </w:r>
       <w:r>
         <w:rPr>
           <w:color w:val="222222"/>
@@ -1784,19 +1750,17 @@
         </w:numPr>
         <w:spacing w:after="20"/>
       </w:pPr>
-      <w:hyperlink w:history="1" r:id="rIdbqzsf03wls08xppuvknww">
-        <w:r>
-          <w:rPr>
-            <w:b/>
-            <w:bCs/>
-            <w:color w:val="5B4B8A"/>
-            <w:sz w:val="20"/>
-            <w:szCs w:val="20"/>
-            <w:rFonts w:ascii="Calibri" w:cs="Calibri" w:eastAsia="Calibri" w:hAnsi="Calibri"/>
-          </w:rPr>
-          <w:t xml:space="preserve">giladlab.uchicago.edu</w:t>
-        </w:r>
-      </w:hyperlink>
+      <w:r>
+        <w:rPr>
+          <w:b/>
+          <w:bCs/>
+          <w:color w:val="5B4B8A"/>
+          <w:sz w:val="20"/>
+          <w:szCs w:val="20"/>
+          <w:rFonts w:ascii="Calibri" w:cs="Calibri" w:eastAsia="Calibri" w:hAnsi="Calibri"/>
+        </w:rPr>
+        <w:t xml:space="preserve">giladlab.uchicago.edu</w:t>
+      </w:r>
       <w:r>
         <w:rPr>
           <w:color w:val="222222"/>
@@ -1816,19 +1780,17 @@
         </w:numPr>
         <w:spacing w:after="20"/>
       </w:pPr>
-      <w:hyperlink w:history="1" r:id="rId1jqnhjxrffwxziqvrov4a">
-        <w:r>
-          <w:rPr>
-            <w:b/>
-            <w:bCs/>
-            <w:color w:val="5B4B8A"/>
-            <w:sz w:val="20"/>
-            <w:szCs w:val="20"/>
-            <w:rFonts w:ascii="Calibri" w:cs="Calibri" w:eastAsia="Calibri" w:hAnsi="Calibri"/>
-          </w:rPr>
-          <w:t xml:space="preserve">chronotek.net</w:t>
-        </w:r>
-      </w:hyperlink>
+      <w:r>
+        <w:rPr>
+          <w:b/>
+          <w:bCs/>
+          <w:color w:val="5B4B8A"/>
+          <w:sz w:val="20"/>
+          <w:szCs w:val="20"/>
+          <w:rFonts w:ascii="Calibri" w:cs="Calibri" w:eastAsia="Calibri" w:hAnsi="Calibri"/>
+        </w:rPr>
+        <w:t xml:space="preserve">chronotek.net</w:t>
+      </w:r>
       <w:r>
         <w:rPr>
           <w:color w:val="222222"/>
@@ -1878,19 +1840,17 @@
         </w:numPr>
         <w:spacing w:after="20"/>
       </w:pPr>
-      <w:hyperlink w:history="1" r:id="rIdik2wjjogez3dhorqfbhs7">
-        <w:r>
-          <w:rPr>
-            <w:b/>
-            <w:bCs/>
-            <w:color w:val="5B4B8A"/>
-            <w:sz w:val="20"/>
-            <w:szCs w:val="20"/>
-            <w:rFonts w:ascii="Calibri" w:cs="Calibri" w:eastAsia="Calibri" w:hAnsi="Calibri"/>
-          </w:rPr>
-          <w:t xml:space="preserve">porterandyork.com</w:t>
-        </w:r>
-      </w:hyperlink>
+      <w:r>
+        <w:rPr>
+          <w:b/>
+          <w:bCs/>
+          <w:color w:val="5B4B8A"/>
+          <w:sz w:val="20"/>
+          <w:szCs w:val="20"/>
+          <w:rFonts w:ascii="Calibri" w:cs="Calibri" w:eastAsia="Calibri" w:hAnsi="Calibri"/>
+        </w:rPr>
+        <w:t xml:space="preserve">porterandyork.com</w:t>
+      </w:r>
       <w:r>
         <w:rPr>
           <w:color w:val="222222"/>
@@ -1910,19 +1870,17 @@
         </w:numPr>
         <w:spacing w:after="20"/>
       </w:pPr>
-      <w:hyperlink w:history="1" r:id="rId7w5rnpnxgqhyxxqmmj0ai">
-        <w:r>
-          <w:rPr>
-            <w:b/>
-            <w:bCs/>
-            <w:color w:val="5B4B8A"/>
-            <w:sz w:val="20"/>
-            <w:szCs w:val="20"/>
-            <w:rFonts w:ascii="Calibri" w:cs="Calibri" w:eastAsia="Calibri" w:hAnsi="Calibri"/>
-          </w:rPr>
-          <w:t xml:space="preserve">bluestarcoffeeroasters.com</w:t>
-        </w:r>
-      </w:hyperlink>
+      <w:r>
+        <w:rPr>
+          <w:b/>
+          <w:bCs/>
+          <w:color w:val="5B4B8A"/>
+          <w:sz w:val="20"/>
+          <w:szCs w:val="20"/>
+          <w:rFonts w:ascii="Calibri" w:cs="Calibri" w:eastAsia="Calibri" w:hAnsi="Calibri"/>
+        </w:rPr>
+        <w:t xml:space="preserve">bluestarcoffeeroasters.com</w:t>
+      </w:r>
       <w:r>
         <w:rPr>
           <w:color w:val="222222"/>
@@ -1958,19 +1916,17 @@
         </w:numPr>
         <w:spacing w:after="20"/>
       </w:pPr>
-      <w:hyperlink w:history="1" r:id="rId09gqpakxnsqhl0laygmtr">
-        <w:r>
-          <w:rPr>
-            <w:b/>
-            <w:bCs/>
-            <w:color w:val="5B4B8A"/>
-            <w:sz w:val="20"/>
-            <w:szCs w:val="20"/>
-            <w:rFonts w:ascii="Calibri" w:cs="Calibri" w:eastAsia="Calibri" w:hAnsi="Calibri"/>
-          </w:rPr>
-          <w:t xml:space="preserve">whatisblik.com</w:t>
-        </w:r>
-      </w:hyperlink>
+      <w:r>
+        <w:rPr>
+          <w:b/>
+          <w:bCs/>
+          <w:color w:val="5B4B8A"/>
+          <w:sz w:val="20"/>
+          <w:szCs w:val="20"/>
+          <w:rFonts w:ascii="Calibri" w:cs="Calibri" w:eastAsia="Calibri" w:hAnsi="Calibri"/>
+        </w:rPr>
+        <w:t xml:space="preserve">whatisblik.com</w:t>
+      </w:r>
       <w:r>
         <w:rPr>
           <w:color w:val="222222"/>
@@ -1990,19 +1946,17 @@
         </w:numPr>
         <w:spacing w:after="20"/>
       </w:pPr>
-      <w:hyperlink w:history="1" r:id="rIdvn5vkxs0xm8iwi0ljemxg">
-        <w:r>
-          <w:rPr>
-            <w:b/>
-            <w:bCs/>
-            <w:color w:val="5B4B8A"/>
-            <w:sz w:val="20"/>
-            <w:szCs w:val="20"/>
-            <w:rFonts w:ascii="Calibri" w:cs="Calibri" w:eastAsia="Calibri" w:hAnsi="Calibri"/>
-          </w:rPr>
-          <w:t xml:space="preserve">zinus.com</w:t>
-        </w:r>
-      </w:hyperlink>
+      <w:r>
+        <w:rPr>
+          <w:b/>
+          <w:bCs/>
+          <w:color w:val="5B4B8A"/>
+          <w:sz w:val="20"/>
+          <w:szCs w:val="20"/>
+          <w:rFonts w:ascii="Calibri" w:cs="Calibri" w:eastAsia="Calibri" w:hAnsi="Calibri"/>
+        </w:rPr>
+        <w:t xml:space="preserve">zinus.com</w:t>
+      </w:r>
       <w:r>
         <w:rPr>
           <w:color w:val="222222"/>

</xml_diff>